<commit_message>
Manuscrito v16: adiciona espaço reservado (destacado) no §2.3 para o κ do 2º revisor
Co-Authored-By: Claude Opus 4.8 <noreply@anthropic.com>
</commit_message>
<xml_diff>
--- a/PDF DA PESQUISA/paper_v16_N7.docx
+++ b/PDF DA PESQUISA/paper_v16_N7.docx
@@ -2366,6 +2366,12 @@
           <w:color w:val="000000"/>
         </w:rPr>
         <w:t>O risco de viés e a aplicabilidade clínica foram avaliados pelo instrumento QUADAS-2,⁴ recomendado pela Cochrane Collaboration, por um único revisor, com auxílio de ferramenta automatizada de extração. Os quatro domínios avaliados foram: (1) seleção de pacientes, (2) teste índice, (3) padrão de referência e (4) fluxo e tempo. Não houve segundo revisor independente nem cálculo de concordância interavaliador (Kappa de Cohen); essa ausência constitui uma limitação do estudo.</w:t>
+      </w:r>
+      <w:r>
+        <w:rPr>
+          <w:highlight w:val="yellow"/>
+        </w:rPr>
+        <w:t xml:space="preserve"> [ESPAÇO RESERVADO — após a 2ª avaliação independente, substituir a frase anterior por: "A avaliação foi conduzida por dois revisores independentes; as discordâncias foram resolvidas por consenso, com concordância interavaliador de κ = ___ (IC 95%: ___–___)", e remover o item de limitação correspondente (§4.5). O κ é calculado em analysis/python/calculate_kappa.py a partir de data/raw/quadas2_reviewer2.csv.]</w:t>
       </w:r>
     </w:p>
     <w:p>

</xml_diff>